<commit_message>
Added a new course to the file.
</commit_message>
<xml_diff>
--- a/courses.docx
+++ b/courses.docx
@@ -12,16 +12,8 @@
         <w:rPr>
           <w:lang w:val="en-US"/>
         </w:rPr>
-        <w:t xml:space="preserve">List of courses offered at </w:t>
+        <w:t>List of courses offered at smarthub</w:t>
       </w:r>
-      <w:proofErr w:type="spellStart"/>
-      <w:r>
-        <w:rPr>
-          <w:lang w:val="en-US"/>
-        </w:rPr>
-        <w:t>smarthub</w:t>
-      </w:r>
-      <w:proofErr w:type="spellEnd"/>
     </w:p>
     <w:p>
       <w:pPr>
@@ -75,6 +67,24 @@
           <w:lang w:val="en-US"/>
         </w:rPr>
         <w:t>Full stack web development</w:t>
+      </w:r>
+    </w:p>
+    <w:p>
+      <w:pPr>
+        <w:pStyle w:val="ListParagraph"/>
+        <w:numPr>
+          <w:ilvl w:val="0"/>
+          <w:numId w:val="1"/>
+        </w:numPr>
+        <w:rPr>
+          <w:lang w:val="en-US"/>
+        </w:rPr>
+      </w:pPr>
+      <w:r>
+        <w:rPr>
+          <w:lang w:val="en-US"/>
+        </w:rPr>
+        <w:t>Ai Engineering</w:t>
       </w:r>
     </w:p>
     <w:p>

</xml_diff>